<commit_message>
ejercicio de mongoDB subido
</commit_message>
<xml_diff>
--- a/DESPLIEGUE_MONGO/DespliegueModeladoERMongo.docx
+++ b/DESPLIEGUE_MONGO/DespliegueModeladoERMongo.docx
@@ -27,6 +27,65 @@
               <w:rFonts w:ascii="Times New Roman" w:hAnsi="Times New Roman" w:cs="Times New Roman"/>
             </w:rPr>
           </w:pPr>
+          <w:r>
+            <w:rPr>
+              <w:rFonts w:ascii="Times New Roman" w:hAnsi="Times New Roman" w:cs="Times New Roman"/>
+              <w:noProof/>
+            </w:rPr>
+            <w:drawing>
+              <wp:anchor distT="0" distB="0" distL="114300" distR="114300" simplePos="0" relativeHeight="251666432" behindDoc="0" locked="0" layoutInCell="1" allowOverlap="1" wp14:anchorId="791BEEDD" wp14:editId="667D120A">
+                <wp:simplePos x="0" y="0"/>
+                <wp:positionH relativeFrom="margin">
+                  <wp:align>right</wp:align>
+                </wp:positionH>
+                <wp:positionV relativeFrom="paragraph">
+                  <wp:posOffset>1415619</wp:posOffset>
+                </wp:positionV>
+                <wp:extent cx="4699435" cy="3352759"/>
+                <wp:effectExtent l="0" t="0" r="6350" b="635"/>
+                <wp:wrapSquare wrapText="bothSides"/>
+                <wp:docPr id="637912270" name="Imagen 7"/>
+                <wp:cNvGraphicFramePr>
+                  <a:graphicFrameLocks xmlns:a="http://schemas.openxmlformats.org/drawingml/2006/main" noChangeAspect="1"/>
+                </wp:cNvGraphicFramePr>
+                <a:graphic xmlns:a="http://schemas.openxmlformats.org/drawingml/2006/main">
+                  <a:graphicData uri="http://schemas.openxmlformats.org/drawingml/2006/picture">
+                    <pic:pic xmlns:pic="http://schemas.openxmlformats.org/drawingml/2006/picture">
+                      <pic:nvPicPr>
+                        <pic:cNvPr id="0" name="Picture 2"/>
+                        <pic:cNvPicPr>
+                          <a:picLocks noChangeAspect="1" noChangeArrowheads="1"/>
+                        </pic:cNvPicPr>
+                      </pic:nvPicPr>
+                      <pic:blipFill>
+                        <a:blip r:embed="rId9" cstate="print">
+                          <a:extLst>
+                            <a:ext uri="{28A0092B-C50C-407E-A947-70E740481C1C}">
+                              <a14:useLocalDpi xmlns:a14="http://schemas.microsoft.com/office/drawing/2010/main" val="0"/>
+                            </a:ext>
+                          </a:extLst>
+                        </a:blip>
+                        <a:srcRect/>
+                        <a:stretch>
+                          <a:fillRect/>
+                        </a:stretch>
+                      </pic:blipFill>
+                      <pic:spPr bwMode="auto">
+                        <a:xfrm>
+                          <a:off x="0" y="0"/>
+                          <a:ext cx="4699435" cy="3352759"/>
+                        </a:xfrm>
+                        <a:prstGeom prst="rect">
+                          <a:avLst/>
+                        </a:prstGeom>
+                        <a:noFill/>
+                      </pic:spPr>
+                    </pic:pic>
+                  </a:graphicData>
+                </a:graphic>
+              </wp:anchor>
+            </w:drawing>
+          </w:r>
           <w:r>
             <w:rPr>
               <w:rFonts w:ascii="Times New Roman" w:hAnsi="Times New Roman" w:cs="Times New Roman"/>
@@ -709,14 +768,27 @@
             </w:rPr>
             <w:fldChar w:fldCharType="separate"/>
           </w:r>
-          <w:hyperlink w:anchor="_Toc215646362" w:history="1">
+          <w:hyperlink w:anchor="_Toc215667695" w:history="1">
             <w:r>
               <w:rPr>
                 <w:rStyle w:val="Hipervnculo"/>
-                <w:rFonts w:ascii="Times New Roman" w:hAnsi="Times New Roman" w:cs="Times New Roman"/>
                 <w:noProof/>
               </w:rPr>
-              <w:t>Modelado de datos en E/R</w:t>
+              <w:t>Introducción al modelad</w:t>
+            </w:r>
+            <w:r>
+              <w:rPr>
+                <w:rStyle w:val="Hipervnculo"/>
+                <w:noProof/>
+              </w:rPr>
+              <w:t>o</w:t>
+            </w:r>
+            <w:r>
+              <w:rPr>
+                <w:rStyle w:val="Hipervnculo"/>
+                <w:noProof/>
+              </w:rPr>
+              <w:t xml:space="preserve"> del proyecto</w:t>
             </w:r>
             <w:r>
               <w:rPr>
@@ -737,7 +809,7 @@
                 <w:noProof/>
                 <w:webHidden/>
               </w:rPr>
-              <w:instrText xml:space="preserve"> PAGEREF _Toc215646362 \h </w:instrText>
+              <w:instrText xml:space="preserve"> PAGEREF _Toc215667695 \h </w:instrText>
             </w:r>
             <w:r>
               <w:rPr>
@@ -780,14 +852,13 @@
               <w:lang w:eastAsia="es-ES"/>
             </w:rPr>
           </w:pPr>
-          <w:hyperlink w:anchor="_Toc215646363" w:history="1">
+          <w:hyperlink w:anchor="_Toc215667696" w:history="1">
             <w:r>
               <w:rPr>
                 <w:rStyle w:val="Hipervnculo"/>
-                <w:rFonts w:ascii="Times New Roman" w:hAnsi="Times New Roman" w:cs="Times New Roman"/>
                 <w:noProof/>
               </w:rPr>
-              <w:t>Modelo adaptado a MongoDB</w:t>
+              <w:t>Modelado de datos en E/R</w:t>
             </w:r>
             <w:r>
               <w:rPr>
@@ -808,7 +879,7 @@
                 <w:noProof/>
                 <w:webHidden/>
               </w:rPr>
-              <w:instrText xml:space="preserve"> PAGEREF _Toc215646363 \h </w:instrText>
+              <w:instrText xml:space="preserve"> PAGEREF _Toc215667696 \h </w:instrText>
             </w:r>
             <w:r>
               <w:rPr>
@@ -828,7 +899,7 @@
                 <w:noProof/>
                 <w:webHidden/>
               </w:rPr>
-              <w:t>10</w:t>
+              <w:t>2</w:t>
             </w:r>
             <w:r>
               <w:rPr>
@@ -851,7 +922,78 @@
               <w:lang w:eastAsia="es-ES"/>
             </w:rPr>
           </w:pPr>
-          <w:hyperlink w:anchor="_Toc215646364" w:history="1">
+          <w:hyperlink w:anchor="_Toc215667697" w:history="1">
+            <w:r>
+              <w:rPr>
+                <w:rStyle w:val="Hipervnculo"/>
+                <w:rFonts w:ascii="Times New Roman" w:hAnsi="Times New Roman" w:cs="Times New Roman"/>
+                <w:noProof/>
+              </w:rPr>
+              <w:t>Modelo adaptado a MongoDB</w:t>
+            </w:r>
+            <w:r>
+              <w:rPr>
+                <w:noProof/>
+                <w:webHidden/>
+              </w:rPr>
+              <w:tab/>
+            </w:r>
+            <w:r>
+              <w:rPr>
+                <w:noProof/>
+                <w:webHidden/>
+              </w:rPr>
+              <w:fldChar w:fldCharType="begin"/>
+            </w:r>
+            <w:r>
+              <w:rPr>
+                <w:noProof/>
+                <w:webHidden/>
+              </w:rPr>
+              <w:instrText xml:space="preserve"> PAGEREF _Toc215667697 \h </w:instrText>
+            </w:r>
+            <w:r>
+              <w:rPr>
+                <w:noProof/>
+                <w:webHidden/>
+              </w:rPr>
+            </w:r>
+            <w:r>
+              <w:rPr>
+                <w:noProof/>
+                <w:webHidden/>
+              </w:rPr>
+              <w:fldChar w:fldCharType="separate"/>
+            </w:r>
+            <w:r>
+              <w:rPr>
+                <w:noProof/>
+                <w:webHidden/>
+              </w:rPr>
+              <w:t>10</w:t>
+            </w:r>
+            <w:r>
+              <w:rPr>
+                <w:noProof/>
+                <w:webHidden/>
+              </w:rPr>
+              <w:fldChar w:fldCharType="end"/>
+            </w:r>
+          </w:hyperlink>
+        </w:p>
+        <w:p>
+          <w:pPr>
+            <w:pStyle w:val="TDC2"/>
+            <w:tabs>
+              <w:tab w:val="right" w:leader="dot" w:pos="8494"/>
+            </w:tabs>
+            <w:rPr>
+              <w:rFonts w:eastAsiaTheme="minorEastAsia"/>
+              <w:noProof/>
+              <w:lang w:eastAsia="es-ES"/>
+            </w:rPr>
+          </w:pPr>
+          <w:hyperlink w:anchor="_Toc215667698" w:history="1">
             <w:r>
               <w:rPr>
                 <w:rStyle w:val="Hipervnculo"/>
@@ -878,7 +1020,7 @@
                 <w:noProof/>
                 <w:webHidden/>
               </w:rPr>
-              <w:instrText xml:space="preserve"> PAGEREF _Toc215646364 \h </w:instrText>
+              <w:instrText xml:space="preserve"> PAGEREF _Toc215667698 \h </w:instrText>
             </w:r>
             <w:r>
               <w:rPr>
@@ -943,20 +1085,33 @@
       <w:pPr>
         <w:pStyle w:val="Ttulo2"/>
       </w:pPr>
-      <w:bookmarkStart w:id="0" w:name="_Toc215646362"/>
+      <w:bookmarkStart w:id="0" w:name="_Toc215667695"/>
       <w:r>
         <w:lastRenderedPageBreak/>
         <w:t>Introducción al modelado del proyecto</w:t>
       </w:r>
-    </w:p>
-    <w:p>
-      <w:r>
-        <w:t>En esta tarea veremos la estructura de datos de mi proyecto llamada Gimnasio Inteligente, en este documento veremos todas las entidades necesarias para el proyecto, así como sus relaciones entre ellas.</w:t>
-      </w:r>
-    </w:p>
-    <w:p>
-      <w:r>
-        <w:t xml:space="preserve">Por otra parte, veremos el paso del modelo relacional al modelo no relacional en MongoDB que trabajaremos con </w:t>
+      <w:bookmarkEnd w:id="0"/>
+    </w:p>
+    <w:p>
+      <w:r>
+        <w:t xml:space="preserve">En esta tarea veremos la estructura de datos de mi proyecto llamada Gimnasio Inteligente, en este documento veremos todas las entidades necesarias para el proyecto, así como </w:t>
+      </w:r>
+      <w:r>
+        <w:t>las</w:t>
+      </w:r>
+      <w:r>
+        <w:t xml:space="preserve"> relaciones entre ellas.</w:t>
+      </w:r>
+    </w:p>
+    <w:p>
+      <w:r>
+        <w:t>Por otra parte, veremos el paso del modelo relacional al modelo no relacional en MongoDB</w:t>
+      </w:r>
+      <w:r>
+        <w:t>,</w:t>
+      </w:r>
+      <w:r>
+        <w:t xml:space="preserve"> trabajaremos con </w:t>
       </w:r>
       <w:proofErr w:type="spellStart"/>
       <w:r>
@@ -979,13 +1134,14 @@
       <w:pPr>
         <w:pStyle w:val="Ttulo2"/>
       </w:pPr>
+      <w:bookmarkStart w:id="1" w:name="_Toc215667696"/>
       <w:r>
         <w:t xml:space="preserve">Modelado de datos en </w:t>
       </w:r>
       <w:r>
         <w:t>E/R</w:t>
       </w:r>
-      <w:bookmarkEnd w:id="0"/>
+      <w:bookmarkEnd w:id="1"/>
     </w:p>
     <w:p>
       <w:pPr>
@@ -1555,32 +1711,6 @@
     </w:p>
     <w:p>
       <w:pPr>
-        <w:rPr>
-          <w:rFonts w:ascii="Times New Roman" w:hAnsi="Times New Roman" w:cs="Times New Roman"/>
-          <w:b/>
-          <w:bCs/>
-        </w:rPr>
-      </w:pPr>
-      <w:r>
-        <w:rPr>
-          <w:rFonts w:ascii="Times New Roman" w:hAnsi="Times New Roman" w:cs="Times New Roman"/>
-          <w:b/>
-          <w:bCs/>
-        </w:rPr>
-        <w:br w:type="page"/>
-      </w:r>
-    </w:p>
-    <w:p>
-      <w:pPr>
-        <w:rPr>
-          <w:rFonts w:ascii="Times New Roman" w:hAnsi="Times New Roman" w:cs="Times New Roman"/>
-          <w:b/>
-          <w:bCs/>
-        </w:rPr>
-      </w:pPr>
-    </w:p>
-    <w:p>
-      <w:pPr>
         <w:jc w:val="both"/>
         <w:rPr>
           <w:rFonts w:ascii="Times New Roman" w:hAnsi="Times New Roman" w:cs="Times New Roman"/>
@@ -1893,6 +2023,23 @@
     </w:p>
     <w:p>
       <w:pPr>
+        <w:rPr>
+          <w:rFonts w:ascii="Times New Roman" w:hAnsi="Times New Roman" w:cs="Times New Roman"/>
+          <w:b/>
+          <w:bCs/>
+        </w:rPr>
+      </w:pPr>
+      <w:r>
+        <w:rPr>
+          <w:rFonts w:ascii="Times New Roman" w:hAnsi="Times New Roman" w:cs="Times New Roman"/>
+          <w:b/>
+          <w:bCs/>
+        </w:rPr>
+        <w:br w:type="page"/>
+      </w:r>
+    </w:p>
+    <w:p>
+      <w:pPr>
         <w:jc w:val="both"/>
         <w:rPr>
           <w:rFonts w:ascii="Times New Roman" w:hAnsi="Times New Roman" w:cs="Times New Roman"/>
@@ -1904,6 +2051,7 @@
           <w:b/>
           <w:bCs/>
         </w:rPr>
+        <w:lastRenderedPageBreak/>
         <w:t>Calendario</w:t>
       </w:r>
       <w:r>
@@ -2119,7 +2267,6 @@
         <w:rPr>
           <w:rFonts w:ascii="Times New Roman" w:hAnsi="Times New Roman" w:cs="Times New Roman"/>
         </w:rPr>
-        <w:lastRenderedPageBreak/>
         <w:t>Nombre</w:t>
       </w:r>
     </w:p>
@@ -2365,6 +2512,23 @@
     </w:p>
     <w:p>
       <w:pPr>
+        <w:rPr>
+          <w:rFonts w:ascii="Times New Roman" w:hAnsi="Times New Roman" w:cs="Times New Roman"/>
+          <w:b/>
+          <w:bCs/>
+        </w:rPr>
+      </w:pPr>
+      <w:r>
+        <w:rPr>
+          <w:rFonts w:ascii="Times New Roman" w:hAnsi="Times New Roman" w:cs="Times New Roman"/>
+          <w:b/>
+          <w:bCs/>
+        </w:rPr>
+        <w:br w:type="page"/>
+      </w:r>
+    </w:p>
+    <w:p>
+      <w:pPr>
         <w:jc w:val="both"/>
         <w:rPr>
           <w:rFonts w:ascii="Times New Roman" w:hAnsi="Times New Roman" w:cs="Times New Roman"/>
@@ -2376,6 +2540,7 @@
           <w:b/>
           <w:bCs/>
         </w:rPr>
+        <w:lastRenderedPageBreak/>
         <w:t>Asistencia</w:t>
       </w:r>
       <w:r>
@@ -2706,7 +2871,6 @@
         <w:rPr>
           <w:rFonts w:ascii="Times New Roman" w:hAnsi="Times New Roman" w:cs="Times New Roman"/>
         </w:rPr>
-        <w:lastRenderedPageBreak/>
         <w:t>Productos_Comprados</w:t>
       </w:r>
       <w:proofErr w:type="spellEnd"/>
@@ -2907,6 +3071,23 @@
     </w:p>
     <w:p>
       <w:pPr>
+        <w:rPr>
+          <w:rFonts w:ascii="Times New Roman" w:hAnsi="Times New Roman" w:cs="Times New Roman"/>
+          <w:b/>
+          <w:bCs/>
+        </w:rPr>
+      </w:pPr>
+      <w:r>
+        <w:rPr>
+          <w:rFonts w:ascii="Times New Roman" w:hAnsi="Times New Roman" w:cs="Times New Roman"/>
+          <w:b/>
+          <w:bCs/>
+        </w:rPr>
+        <w:br w:type="page"/>
+      </w:r>
+    </w:p>
+    <w:p>
+      <w:pPr>
         <w:jc w:val="both"/>
         <w:rPr>
           <w:rFonts w:ascii="Times New Roman" w:hAnsi="Times New Roman" w:cs="Times New Roman"/>
@@ -2920,6 +3101,7 @@
           <w:b/>
           <w:bCs/>
         </w:rPr>
+        <w:lastRenderedPageBreak/>
         <w:t xml:space="preserve">Modelo Entidad-Relación de la aplicación Gimnasio inteligente </w:t>
       </w:r>
     </w:p>
@@ -2969,7 +3151,7 @@
                     </pic:cNvPicPr>
                   </pic:nvPicPr>
                   <pic:blipFill rotWithShape="1">
-                    <a:blip r:embed="rId9" cstate="print">
+                    <a:blip r:embed="rId10" cstate="print">
                       <a:extLst>
                         <a:ext uri="{28A0092B-C50C-407E-A947-70E740481C1C}">
                           <a14:useLocalDpi xmlns:a14="http://schemas.microsoft.com/office/drawing/2010/main" val="0"/>
@@ -3021,7 +3203,6 @@
           <w:b/>
           <w:bCs/>
         </w:rPr>
-        <w:lastRenderedPageBreak/>
         <w:t xml:space="preserve">Relaciones </w:t>
       </w:r>
     </w:p>
@@ -3231,6 +3412,7 @@
           <w:b/>
           <w:bCs/>
         </w:rPr>
+        <w:lastRenderedPageBreak/>
         <w:t>Explicación</w:t>
       </w:r>
       <w:r>
@@ -3274,35 +3456,7 @@
         <w:rPr>
           <w:rFonts w:ascii="Times New Roman" w:hAnsi="Times New Roman" w:cs="Times New Roman"/>
         </w:rPr>
-        <w:t>Cliente (</w:t>
-      </w:r>
-      <w:proofErr w:type="gramStart"/>
-      <w:r>
-        <w:rPr>
-          <w:rFonts w:ascii="Times New Roman" w:hAnsi="Times New Roman" w:cs="Times New Roman"/>
-        </w:rPr>
-        <w:t>0,N</w:t>
-      </w:r>
-      <w:proofErr w:type="gramEnd"/>
-      <w:r>
-        <w:rPr>
-          <w:rFonts w:ascii="Times New Roman" w:hAnsi="Times New Roman" w:cs="Times New Roman"/>
-        </w:rPr>
-        <w:t>) ↔ Clase (</w:t>
-      </w:r>
-      <w:proofErr w:type="gramStart"/>
-      <w:r>
-        <w:rPr>
-          <w:rFonts w:ascii="Times New Roman" w:hAnsi="Times New Roman" w:cs="Times New Roman"/>
-        </w:rPr>
-        <w:t>0,N</w:t>
-      </w:r>
-      <w:proofErr w:type="gramEnd"/>
-      <w:r>
-        <w:rPr>
-          <w:rFonts w:ascii="Times New Roman" w:hAnsi="Times New Roman" w:cs="Times New Roman"/>
-        </w:rPr>
-        <w:t>)</w:t>
+        <w:t>Cliente (0,N) ↔ Clase (0,N)</w:t>
       </w:r>
     </w:p>
     <w:p>
@@ -3321,21 +3475,7 @@
         <w:rPr>
           <w:rFonts w:ascii="Times New Roman" w:hAnsi="Times New Roman" w:cs="Times New Roman"/>
         </w:rPr>
-        <w:t>Cliente (</w:t>
-      </w:r>
-      <w:proofErr w:type="gramStart"/>
-      <w:r>
-        <w:rPr>
-          <w:rFonts w:ascii="Times New Roman" w:hAnsi="Times New Roman" w:cs="Times New Roman"/>
-        </w:rPr>
-        <w:t>1,N</w:t>
-      </w:r>
-      <w:proofErr w:type="gramEnd"/>
-      <w:r>
-        <w:rPr>
-          <w:rFonts w:ascii="Times New Roman" w:hAnsi="Times New Roman" w:cs="Times New Roman"/>
-        </w:rPr>
-        <w:t>) ↔ Asistencia (1,1)</w:t>
+        <w:t>Cliente (1,N) ↔ Asistencia (1,1)</w:t>
       </w:r>
     </w:p>
     <w:p>
@@ -3354,21 +3494,7 @@
         <w:rPr>
           <w:rFonts w:ascii="Times New Roman" w:hAnsi="Times New Roman" w:cs="Times New Roman"/>
         </w:rPr>
-        <w:t>Clase (</w:t>
-      </w:r>
-      <w:proofErr w:type="gramStart"/>
-      <w:r>
-        <w:rPr>
-          <w:rFonts w:ascii="Times New Roman" w:hAnsi="Times New Roman" w:cs="Times New Roman"/>
-        </w:rPr>
-        <w:t>1,N</w:t>
-      </w:r>
-      <w:proofErr w:type="gramEnd"/>
-      <w:r>
-        <w:rPr>
-          <w:rFonts w:ascii="Times New Roman" w:hAnsi="Times New Roman" w:cs="Times New Roman"/>
-        </w:rPr>
-        <w:t>) ↔ Asistencia (1,1)</w:t>
+        <w:t>Clase (1,N) ↔ Asistencia (1,1)</w:t>
       </w:r>
     </w:p>
     <w:p>
@@ -3479,21 +3605,7 @@
         <w:rPr>
           <w:rFonts w:ascii="Times New Roman" w:hAnsi="Times New Roman" w:cs="Times New Roman"/>
         </w:rPr>
-        <w:t>Instructor (1,1) ↔ Clase (</w:t>
-      </w:r>
-      <w:proofErr w:type="gramStart"/>
-      <w:r>
-        <w:rPr>
-          <w:rFonts w:ascii="Times New Roman" w:hAnsi="Times New Roman" w:cs="Times New Roman"/>
-        </w:rPr>
-        <w:t>0,N</w:t>
-      </w:r>
-      <w:proofErr w:type="gramEnd"/>
-      <w:r>
-        <w:rPr>
-          <w:rFonts w:ascii="Times New Roman" w:hAnsi="Times New Roman" w:cs="Times New Roman"/>
-        </w:rPr>
-        <w:t>)</w:t>
+        <w:t>Instructor (1,1) ↔ Clase (0,N)</w:t>
       </w:r>
     </w:p>
     <w:p>
@@ -3598,21 +3710,7 @@
         <w:rPr>
           <w:rFonts w:ascii="Times New Roman" w:hAnsi="Times New Roman" w:cs="Times New Roman"/>
         </w:rPr>
-        <w:t>Clase (1,1) ↔ Calendario (</w:t>
-      </w:r>
-      <w:proofErr w:type="gramStart"/>
-      <w:r>
-        <w:rPr>
-          <w:rFonts w:ascii="Times New Roman" w:hAnsi="Times New Roman" w:cs="Times New Roman"/>
-        </w:rPr>
-        <w:t>0,N</w:t>
-      </w:r>
-      <w:proofErr w:type="gramEnd"/>
-      <w:r>
-        <w:rPr>
-          <w:rFonts w:ascii="Times New Roman" w:hAnsi="Times New Roman" w:cs="Times New Roman"/>
-        </w:rPr>
-        <w:t>)</w:t>
+        <w:t>Clase (1,1) ↔ Calendario (0,N)</w:t>
       </w:r>
     </w:p>
     <w:p>
@@ -3844,21 +3942,7 @@
         <w:rPr>
           <w:rFonts w:ascii="Times New Roman" w:hAnsi="Times New Roman" w:cs="Times New Roman"/>
         </w:rPr>
-        <w:t>Cliente (1,1) ↔ Venta (</w:t>
-      </w:r>
-      <w:proofErr w:type="gramStart"/>
-      <w:r>
-        <w:rPr>
-          <w:rFonts w:ascii="Times New Roman" w:hAnsi="Times New Roman" w:cs="Times New Roman"/>
-        </w:rPr>
-        <w:t>0,N</w:t>
-      </w:r>
-      <w:proofErr w:type="gramEnd"/>
-      <w:r>
-        <w:rPr>
-          <w:rFonts w:ascii="Times New Roman" w:hAnsi="Times New Roman" w:cs="Times New Roman"/>
-        </w:rPr>
-        <w:t>)</w:t>
+        <w:t>Cliente (1,1) ↔ Venta (0,N)</w:t>
       </w:r>
     </w:p>
     <w:p>
@@ -3968,21 +4052,7 @@
         <w:rPr>
           <w:rFonts w:ascii="Times New Roman" w:hAnsi="Times New Roman" w:cs="Times New Roman"/>
         </w:rPr>
-        <w:t>Producto (1,1) ↔ Venta (</w:t>
-      </w:r>
-      <w:proofErr w:type="gramStart"/>
-      <w:r>
-        <w:rPr>
-          <w:rFonts w:ascii="Times New Roman" w:hAnsi="Times New Roman" w:cs="Times New Roman"/>
-        </w:rPr>
-        <w:t>0,N</w:t>
-      </w:r>
-      <w:proofErr w:type="gramEnd"/>
-      <w:r>
-        <w:rPr>
-          <w:rFonts w:ascii="Times New Roman" w:hAnsi="Times New Roman" w:cs="Times New Roman"/>
-        </w:rPr>
-        <w:t>)</w:t>
+        <w:t>Producto (1,1) ↔ Venta (0,N)</w:t>
       </w:r>
     </w:p>
     <w:p>
@@ -4092,21 +4162,7 @@
         <w:rPr>
           <w:rFonts w:ascii="Times New Roman" w:hAnsi="Times New Roman" w:cs="Times New Roman"/>
         </w:rPr>
-        <w:t>Cliente (1,1) ↔ Asistencia (</w:t>
-      </w:r>
-      <w:proofErr w:type="gramStart"/>
-      <w:r>
-        <w:rPr>
-          <w:rFonts w:ascii="Times New Roman" w:hAnsi="Times New Roman" w:cs="Times New Roman"/>
-        </w:rPr>
-        <w:t>0,N</w:t>
-      </w:r>
-      <w:proofErr w:type="gramEnd"/>
-      <w:r>
-        <w:rPr>
-          <w:rFonts w:ascii="Times New Roman" w:hAnsi="Times New Roman" w:cs="Times New Roman"/>
-        </w:rPr>
-        <w:t>)</w:t>
+        <w:t>Cliente (1,1) ↔ Asistencia (0,N)</w:t>
       </w:r>
     </w:p>
     <w:p>
@@ -4216,21 +4272,7 @@
         <w:rPr>
           <w:rFonts w:ascii="Times New Roman" w:hAnsi="Times New Roman" w:cs="Times New Roman"/>
         </w:rPr>
-        <w:t>Clase (1,1) ↔ Asistencia (</w:t>
-      </w:r>
-      <w:proofErr w:type="gramStart"/>
-      <w:r>
-        <w:rPr>
-          <w:rFonts w:ascii="Times New Roman" w:hAnsi="Times New Roman" w:cs="Times New Roman"/>
-        </w:rPr>
-        <w:t>0,N</w:t>
-      </w:r>
-      <w:proofErr w:type="gramEnd"/>
-      <w:r>
-        <w:rPr>
-          <w:rFonts w:ascii="Times New Roman" w:hAnsi="Times New Roman" w:cs="Times New Roman"/>
-        </w:rPr>
-        <w:t>)</w:t>
+        <w:t>Clase (1,1) ↔ Asistencia (0,N)</w:t>
       </w:r>
     </w:p>
     <w:p>
@@ -4394,21 +4436,7 @@
         <w:rPr>
           <w:rFonts w:ascii="Times New Roman" w:hAnsi="Times New Roman" w:cs="Times New Roman"/>
         </w:rPr>
-        <w:t xml:space="preserve"> (</w:t>
-      </w:r>
-      <w:proofErr w:type="gramStart"/>
-      <w:r>
-        <w:rPr>
-          <w:rFonts w:ascii="Times New Roman" w:hAnsi="Times New Roman" w:cs="Times New Roman"/>
-        </w:rPr>
-        <w:t>0,N</w:t>
-      </w:r>
-      <w:proofErr w:type="gramEnd"/>
-      <w:r>
-        <w:rPr>
-          <w:rFonts w:ascii="Times New Roman" w:hAnsi="Times New Roman" w:cs="Times New Roman"/>
-        </w:rPr>
-        <w:t>)</w:t>
+        <w:t xml:space="preserve"> (0,N)</w:t>
       </w:r>
     </w:p>
     <w:p>
@@ -4552,21 +4580,7 @@
         <w:rPr>
           <w:rFonts w:ascii="Times New Roman" w:hAnsi="Times New Roman" w:cs="Times New Roman"/>
         </w:rPr>
-        <w:t xml:space="preserve"> (</w:t>
-      </w:r>
-      <w:proofErr w:type="gramStart"/>
-      <w:r>
-        <w:rPr>
-          <w:rFonts w:ascii="Times New Roman" w:hAnsi="Times New Roman" w:cs="Times New Roman"/>
-        </w:rPr>
-        <w:t>0,N</w:t>
-      </w:r>
-      <w:proofErr w:type="gramEnd"/>
-      <w:r>
-        <w:rPr>
-          <w:rFonts w:ascii="Times New Roman" w:hAnsi="Times New Roman" w:cs="Times New Roman"/>
-        </w:rPr>
-        <w:t>)</w:t>
+        <w:t xml:space="preserve"> (0,N)</w:t>
       </w:r>
     </w:p>
     <w:p>
@@ -5160,27 +5174,7 @@
                 <w:lang w:eastAsia="es-ES"/>
                 <w14:ligatures w14:val="none"/>
               </w:rPr>
-              <w:t xml:space="preserve">DNI → </w:t>
-            </w:r>
-            <w:proofErr w:type="gramStart"/>
-            <w:r>
-              <w:rPr>
-                <w:rFonts w:ascii="Times New Roman" w:eastAsia="Times New Roman" w:hAnsi="Times New Roman" w:cs="Times New Roman"/>
-                <w:kern w:val="0"/>
-                <w:lang w:eastAsia="es-ES"/>
-                <w14:ligatures w14:val="none"/>
-              </w:rPr>
-              <w:t>Usuario(</w:t>
-            </w:r>
-            <w:proofErr w:type="gramEnd"/>
-            <w:r>
-              <w:rPr>
-                <w:rFonts w:ascii="Times New Roman" w:eastAsia="Times New Roman" w:hAnsi="Times New Roman" w:cs="Times New Roman"/>
-                <w:kern w:val="0"/>
-                <w:lang w:eastAsia="es-ES"/>
-                <w14:ligatures w14:val="none"/>
-              </w:rPr>
-              <w:t>DNI)</w:t>
+              <w:t>DNI → Usuario(DNI)</w:t>
             </w:r>
           </w:p>
         </w:tc>
@@ -5344,20 +5338,9 @@
                 <w:lang w:eastAsia="es-ES"/>
                 <w14:ligatures w14:val="none"/>
               </w:rPr>
-              <w:t xml:space="preserve"> → </w:t>
-            </w:r>
-            <w:proofErr w:type="gramStart"/>
-            <w:r>
-              <w:rPr>
-                <w:rFonts w:ascii="Times New Roman" w:eastAsia="Times New Roman" w:hAnsi="Times New Roman" w:cs="Times New Roman"/>
-                <w:kern w:val="0"/>
-                <w:lang w:eastAsia="es-ES"/>
-                <w14:ligatures w14:val="none"/>
-              </w:rPr>
-              <w:t>Instructor(</w:t>
+              <w:t xml:space="preserve"> → Instructor(</w:t>
             </w:r>
             <w:proofErr w:type="spellStart"/>
-            <w:proofErr w:type="gramEnd"/>
             <w:r>
               <w:rPr>
                 <w:rFonts w:ascii="Times New Roman" w:eastAsia="Times New Roman" w:hAnsi="Times New Roman" w:cs="Times New Roman"/>
@@ -5528,20 +5511,9 @@
                 <w:lang w:eastAsia="es-ES"/>
                 <w14:ligatures w14:val="none"/>
               </w:rPr>
-              <w:t xml:space="preserve"> → </w:t>
-            </w:r>
-            <w:proofErr w:type="gramStart"/>
-            <w:r>
-              <w:rPr>
-                <w:rFonts w:ascii="Times New Roman" w:eastAsia="Times New Roman" w:hAnsi="Times New Roman" w:cs="Times New Roman"/>
-                <w:kern w:val="0"/>
-                <w:lang w:eastAsia="es-ES"/>
-                <w14:ligatures w14:val="none"/>
-              </w:rPr>
-              <w:t>Clase(</w:t>
+              <w:t xml:space="preserve"> → Clase(</w:t>
             </w:r>
             <w:proofErr w:type="spellStart"/>
-            <w:proofErr w:type="gramEnd"/>
             <w:r>
               <w:rPr>
                 <w:rFonts w:ascii="Times New Roman" w:eastAsia="Times New Roman" w:hAnsi="Times New Roman" w:cs="Times New Roman"/>
@@ -5854,9 +5826,9 @@
                 <w:lang w:eastAsia="es-ES"/>
                 <w14:ligatures w14:val="none"/>
               </w:rPr>
-              <w:t xml:space="preserve"> → </w:t>
+              <w:t xml:space="preserve"> → Cliente(</w:t>
             </w:r>
-            <w:proofErr w:type="gramStart"/>
+            <w:proofErr w:type="spellStart"/>
             <w:r>
               <w:rPr>
                 <w:rFonts w:ascii="Times New Roman" w:eastAsia="Times New Roman" w:hAnsi="Times New Roman" w:cs="Times New Roman"/>
@@ -5864,10 +5836,9 @@
                 <w:lang w:eastAsia="es-ES"/>
                 <w14:ligatures w14:val="none"/>
               </w:rPr>
-              <w:t>Cliente(</w:t>
+              <w:t>ID_Cliente</w:t>
             </w:r>
-            <w:proofErr w:type="spellStart"/>
-            <w:proofErr w:type="gramEnd"/>
+            <w:proofErr w:type="spellEnd"/>
             <w:r>
               <w:rPr>
                 <w:rFonts w:ascii="Times New Roman" w:eastAsia="Times New Roman" w:hAnsi="Times New Roman" w:cs="Times New Roman"/>
@@ -5875,9 +5846,9 @@
                 <w:lang w:eastAsia="es-ES"/>
                 <w14:ligatures w14:val="none"/>
               </w:rPr>
-              <w:t>ID_Cliente</w:t>
+              <w:t xml:space="preserve">), </w:t>
             </w:r>
-            <w:proofErr w:type="spellEnd"/>
+            <w:proofErr w:type="spellStart"/>
             <w:r>
               <w:rPr>
                 <w:rFonts w:ascii="Times New Roman" w:eastAsia="Times New Roman" w:hAnsi="Times New Roman" w:cs="Times New Roman"/>
@@ -5885,9 +5856,9 @@
                 <w:lang w:eastAsia="es-ES"/>
                 <w14:ligatures w14:val="none"/>
               </w:rPr>
-              <w:t xml:space="preserve">), </w:t>
+              <w:t>ID_Producto</w:t>
             </w:r>
-            <w:proofErr w:type="spellStart"/>
+            <w:proofErr w:type="spellEnd"/>
             <w:r>
               <w:rPr>
                 <w:rFonts w:ascii="Times New Roman" w:eastAsia="Times New Roman" w:hAnsi="Times New Roman" w:cs="Times New Roman"/>
@@ -5895,30 +5866,9 @@
                 <w:lang w:eastAsia="es-ES"/>
                 <w14:ligatures w14:val="none"/>
               </w:rPr>
-              <w:t>ID_Producto</w:t>
-            </w:r>
-            <w:proofErr w:type="spellEnd"/>
-            <w:r>
-              <w:rPr>
-                <w:rFonts w:ascii="Times New Roman" w:eastAsia="Times New Roman" w:hAnsi="Times New Roman" w:cs="Times New Roman"/>
-                <w:kern w:val="0"/>
-                <w:lang w:eastAsia="es-ES"/>
-                <w14:ligatures w14:val="none"/>
-              </w:rPr>
-              <w:t xml:space="preserve"> → </w:t>
-            </w:r>
-            <w:proofErr w:type="gramStart"/>
-            <w:r>
-              <w:rPr>
-                <w:rFonts w:ascii="Times New Roman" w:eastAsia="Times New Roman" w:hAnsi="Times New Roman" w:cs="Times New Roman"/>
-                <w:kern w:val="0"/>
-                <w:lang w:eastAsia="es-ES"/>
-                <w14:ligatures w14:val="none"/>
-              </w:rPr>
-              <w:t>Producto(</w:t>
+              <w:t xml:space="preserve"> → Producto(</w:t>
             </w:r>
             <w:proofErr w:type="spellStart"/>
-            <w:proofErr w:type="gramEnd"/>
             <w:r>
               <w:rPr>
                 <w:rFonts w:ascii="Times New Roman" w:eastAsia="Times New Roman" w:hAnsi="Times New Roman" w:cs="Times New Roman"/>
@@ -6110,9 +6060,9 @@
                 <w:lang w:eastAsia="es-ES"/>
                 <w14:ligatures w14:val="none"/>
               </w:rPr>
-              <w:t xml:space="preserve"> → </w:t>
+              <w:t xml:space="preserve"> → Cliente(</w:t>
             </w:r>
-            <w:proofErr w:type="gramStart"/>
+            <w:proofErr w:type="spellStart"/>
             <w:r>
               <w:rPr>
                 <w:rFonts w:ascii="Times New Roman" w:eastAsia="Times New Roman" w:hAnsi="Times New Roman" w:cs="Times New Roman"/>
@@ -6120,10 +6070,9 @@
                 <w:lang w:eastAsia="es-ES"/>
                 <w14:ligatures w14:val="none"/>
               </w:rPr>
-              <w:t>Cliente(</w:t>
+              <w:t>ID_Cliente</w:t>
             </w:r>
-            <w:proofErr w:type="spellStart"/>
-            <w:proofErr w:type="gramEnd"/>
+            <w:proofErr w:type="spellEnd"/>
             <w:r>
               <w:rPr>
                 <w:rFonts w:ascii="Times New Roman" w:eastAsia="Times New Roman" w:hAnsi="Times New Roman" w:cs="Times New Roman"/>
@@ -6131,9 +6080,9 @@
                 <w:lang w:eastAsia="es-ES"/>
                 <w14:ligatures w14:val="none"/>
               </w:rPr>
-              <w:t>ID_Cliente</w:t>
+              <w:t xml:space="preserve">), </w:t>
             </w:r>
-            <w:proofErr w:type="spellEnd"/>
+            <w:proofErr w:type="spellStart"/>
             <w:r>
               <w:rPr>
                 <w:rFonts w:ascii="Times New Roman" w:eastAsia="Times New Roman" w:hAnsi="Times New Roman" w:cs="Times New Roman"/>
@@ -6141,9 +6090,9 @@
                 <w:lang w:eastAsia="es-ES"/>
                 <w14:ligatures w14:val="none"/>
               </w:rPr>
-              <w:t xml:space="preserve">), </w:t>
+              <w:t>ID_Clase</w:t>
             </w:r>
-            <w:proofErr w:type="spellStart"/>
+            <w:proofErr w:type="spellEnd"/>
             <w:r>
               <w:rPr>
                 <w:rFonts w:ascii="Times New Roman" w:eastAsia="Times New Roman" w:hAnsi="Times New Roman" w:cs="Times New Roman"/>
@@ -6151,30 +6100,9 @@
                 <w:lang w:eastAsia="es-ES"/>
                 <w14:ligatures w14:val="none"/>
               </w:rPr>
-              <w:t>ID_Clase</w:t>
-            </w:r>
-            <w:proofErr w:type="spellEnd"/>
-            <w:r>
-              <w:rPr>
-                <w:rFonts w:ascii="Times New Roman" w:eastAsia="Times New Roman" w:hAnsi="Times New Roman" w:cs="Times New Roman"/>
-                <w:kern w:val="0"/>
-                <w:lang w:eastAsia="es-ES"/>
-                <w14:ligatures w14:val="none"/>
-              </w:rPr>
-              <w:t xml:space="preserve"> → </w:t>
-            </w:r>
-            <w:proofErr w:type="gramStart"/>
-            <w:r>
-              <w:rPr>
-                <w:rFonts w:ascii="Times New Roman" w:eastAsia="Times New Roman" w:hAnsi="Times New Roman" w:cs="Times New Roman"/>
-                <w:kern w:val="0"/>
-                <w:lang w:eastAsia="es-ES"/>
-                <w14:ligatures w14:val="none"/>
-              </w:rPr>
-              <w:t>Clase(</w:t>
+              <w:t xml:space="preserve"> → Clase(</w:t>
             </w:r>
             <w:proofErr w:type="spellStart"/>
-            <w:proofErr w:type="gramEnd"/>
             <w:r>
               <w:rPr>
                 <w:rFonts w:ascii="Times New Roman" w:eastAsia="Times New Roman" w:hAnsi="Times New Roman" w:cs="Times New Roman"/>
@@ -6418,20 +6346,9 @@
                 <w:lang w:eastAsia="es-ES"/>
                 <w14:ligatures w14:val="none"/>
               </w:rPr>
-              <w:t xml:space="preserve"> → </w:t>
-            </w:r>
-            <w:proofErr w:type="gramStart"/>
-            <w:r>
-              <w:rPr>
-                <w:rFonts w:ascii="Times New Roman" w:eastAsia="Times New Roman" w:hAnsi="Times New Roman" w:cs="Times New Roman"/>
-                <w:kern w:val="0"/>
-                <w:lang w:eastAsia="es-ES"/>
-                <w14:ligatures w14:val="none"/>
-              </w:rPr>
-              <w:t>Cliente(</w:t>
+              <w:t xml:space="preserve"> → Cliente(</w:t>
             </w:r>
             <w:proofErr w:type="spellStart"/>
-            <w:proofErr w:type="gramEnd"/>
             <w:r>
               <w:rPr>
                 <w:rFonts w:ascii="Times New Roman" w:eastAsia="Times New Roman" w:hAnsi="Times New Roman" w:cs="Times New Roman"/>
@@ -6665,14 +6582,14 @@
           <w:rFonts w:ascii="Times New Roman" w:hAnsi="Times New Roman" w:cs="Times New Roman"/>
         </w:rPr>
       </w:pPr>
-      <w:bookmarkStart w:id="1" w:name="_Toc215646363"/>
+      <w:bookmarkStart w:id="2" w:name="_Toc215667697"/>
       <w:r>
         <w:rPr>
           <w:rFonts w:ascii="Times New Roman" w:hAnsi="Times New Roman" w:cs="Times New Roman"/>
         </w:rPr>
         <w:t>Modelo adaptado a MongoDB</w:t>
       </w:r>
-      <w:bookmarkEnd w:id="1"/>
+      <w:bookmarkEnd w:id="2"/>
     </w:p>
     <w:p>
       <w:pPr>
@@ -6964,7 +6881,7 @@
                     <pic:cNvPicPr/>
                   </pic:nvPicPr>
                   <pic:blipFill>
-                    <a:blip r:embed="rId10"/>
+                    <a:blip r:embed="rId11"/>
                     <a:stretch>
                       <a:fillRect/>
                     </a:stretch>
@@ -7099,21 +7016,7 @@
         <w:rPr>
           <w:rFonts w:ascii="Times New Roman" w:hAnsi="Times New Roman" w:cs="Times New Roman"/>
         </w:rPr>
-        <w:t xml:space="preserve"> del cliente en </w:t>
-      </w:r>
-      <w:proofErr w:type="gramStart"/>
-      <w:r>
-        <w:rPr>
-          <w:rFonts w:ascii="Times New Roman" w:hAnsi="Times New Roman" w:cs="Times New Roman"/>
-        </w:rPr>
-        <w:t>ejercicios,  número</w:t>
-      </w:r>
-      <w:proofErr w:type="gramEnd"/>
-      <w:r>
-        <w:rPr>
-          <w:rFonts w:ascii="Times New Roman" w:hAnsi="Times New Roman" w:cs="Times New Roman"/>
-        </w:rPr>
-        <w:t xml:space="preserve"> de productos comprados y la fecha de generación del informe.</w:t>
+        <w:t xml:space="preserve"> del cliente en ejercicios,  número de productos comprados y la fecha de generación del informe.</w:t>
       </w:r>
     </w:p>
     <w:p>
@@ -7534,7 +7437,7 @@
                     <pic:cNvPicPr/>
                   </pic:nvPicPr>
                   <pic:blipFill>
-                    <a:blip r:embed="rId11"/>
+                    <a:blip r:embed="rId12"/>
                     <a:stretch>
                       <a:fillRect/>
                     </a:stretch>
@@ -7588,28 +7491,14 @@
         <w:rPr>
           <w:rFonts w:ascii="Times New Roman" w:hAnsi="Times New Roman" w:cs="Times New Roman"/>
         </w:rPr>
-        <w:t>id_</w:t>
-      </w:r>
-      <w:proofErr w:type="gramStart"/>
-      <w:r>
-        <w:rPr>
-          <w:rFonts w:ascii="Times New Roman" w:hAnsi="Times New Roman" w:cs="Times New Roman"/>
-        </w:rPr>
-        <w:t>Instructor</w:t>
+        <w:t>id_Instructor</w:t>
       </w:r>
       <w:proofErr w:type="spellEnd"/>
       <w:r>
         <w:rPr>
           <w:rFonts w:ascii="Times New Roman" w:hAnsi="Times New Roman" w:cs="Times New Roman"/>
         </w:rPr>
-        <w:t xml:space="preserve">  ya</w:t>
-      </w:r>
-      <w:proofErr w:type="gramEnd"/>
-      <w:r>
-        <w:rPr>
-          <w:rFonts w:ascii="Times New Roman" w:hAnsi="Times New Roman" w:cs="Times New Roman"/>
-        </w:rPr>
-        <w:t xml:space="preserve"> que será nuestra clave principal, luego pondremos como llave foránea el </w:t>
+        <w:t xml:space="preserve">  ya que será nuestra clave principal, luego pondremos como llave foránea el </w:t>
       </w:r>
       <w:proofErr w:type="spellStart"/>
       <w:r>
@@ -7673,19 +7562,11 @@
         <w:t>ID_Instructor</w:t>
       </w:r>
       <w:proofErr w:type="spellEnd"/>
-      <w:proofErr w:type="gramStart"/>
-      <w:r>
-        <w:rPr>
-          <w:rFonts w:ascii="Times New Roman" w:hAnsi="Times New Roman" w:cs="Times New Roman"/>
-        </w:rPr>
-        <w:t>",  /</w:t>
-      </w:r>
-      <w:proofErr w:type="gramEnd"/>
-      <w:r>
-        <w:rPr>
-          <w:rFonts w:ascii="Times New Roman" w:hAnsi="Times New Roman" w:cs="Times New Roman"/>
-        </w:rPr>
-        <w:t>/ Clave primaria</w:t>
+      <w:r>
+        <w:rPr>
+          <w:rFonts w:ascii="Times New Roman" w:hAnsi="Times New Roman" w:cs="Times New Roman"/>
+        </w:rPr>
+        <w:t>",  // Clave primaria</w:t>
       </w:r>
     </w:p>
     <w:p>
@@ -7708,34 +7589,18 @@
         <w:t>string</w:t>
       </w:r>
       <w:proofErr w:type="spellEnd"/>
-      <w:proofErr w:type="gramStart"/>
-      <w:r>
-        <w:rPr>
-          <w:rFonts w:ascii="Times New Roman" w:hAnsi="Times New Roman" w:cs="Times New Roman"/>
-        </w:rPr>
-        <w:t xml:space="preserve">",   </w:t>
-      </w:r>
-      <w:proofErr w:type="gramEnd"/>
-      <w:r>
-        <w:rPr>
-          <w:rFonts w:ascii="Times New Roman" w:hAnsi="Times New Roman" w:cs="Times New Roman"/>
-        </w:rPr>
-        <w:t xml:space="preserve">       // Clave foránea → </w:t>
+      <w:r>
+        <w:rPr>
+          <w:rFonts w:ascii="Times New Roman" w:hAnsi="Times New Roman" w:cs="Times New Roman"/>
+        </w:rPr>
+        <w:t xml:space="preserve">",          // Clave foránea → </w:t>
       </w:r>
       <w:proofErr w:type="spellStart"/>
-      <w:proofErr w:type="gramStart"/>
-      <w:r>
-        <w:rPr>
-          <w:rFonts w:ascii="Times New Roman" w:hAnsi="Times New Roman" w:cs="Times New Roman"/>
-        </w:rPr>
-        <w:t>usuarios._</w:t>
-      </w:r>
-      <w:proofErr w:type="gramEnd"/>
-      <w:r>
-        <w:rPr>
-          <w:rFonts w:ascii="Times New Roman" w:hAnsi="Times New Roman" w:cs="Times New Roman"/>
-        </w:rPr>
-        <w:t>id</w:t>
+      <w:r>
+        <w:rPr>
+          <w:rFonts w:ascii="Times New Roman" w:hAnsi="Times New Roman" w:cs="Times New Roman"/>
+        </w:rPr>
+        <w:t>usuarios._id</w:t>
       </w:r>
       <w:proofErr w:type="spellEnd"/>
     </w:p>
@@ -7847,7 +7712,7 @@
                     <pic:cNvPicPr/>
                   </pic:nvPicPr>
                   <pic:blipFill>
-                    <a:blip r:embed="rId12"/>
+                    <a:blip r:embed="rId13"/>
                     <a:stretch>
                       <a:fillRect/>
                     </a:stretch>
@@ -8024,7 +7889,7 @@
                     <pic:cNvPicPr/>
                   </pic:nvPicPr>
                   <pic:blipFill>
-                    <a:blip r:embed="rId13"/>
+                    <a:blip r:embed="rId14"/>
                     <a:stretch>
                       <a:fillRect/>
                     </a:stretch>
@@ -8592,7 +8457,7 @@
                     <pic:cNvPicPr/>
                   </pic:nvPicPr>
                   <pic:blipFill>
-                    <a:blip r:embed="rId14"/>
+                    <a:blip r:embed="rId15"/>
                     <a:stretch>
                       <a:fillRect/>
                     </a:stretch>
@@ -8635,14 +8500,32 @@
       <w:pPr>
         <w:rPr>
           <w:rFonts w:ascii="Times New Roman" w:hAnsi="Times New Roman" w:cs="Times New Roman"/>
-        </w:rPr>
-      </w:pPr>
-      <w:r>
-        <w:rPr>
-          <w:rFonts w:ascii="Times New Roman" w:hAnsi="Times New Roman" w:cs="Times New Roman"/>
-          <w:b/>
-          <w:bCs/>
-        </w:rPr>
+          <w:b/>
+          <w:bCs/>
+        </w:rPr>
+      </w:pPr>
+      <w:r>
+        <w:rPr>
+          <w:rFonts w:ascii="Times New Roman" w:hAnsi="Times New Roman" w:cs="Times New Roman"/>
+          <w:b/>
+          <w:bCs/>
+        </w:rPr>
+        <w:br w:type="page"/>
+      </w:r>
+    </w:p>
+    <w:p>
+      <w:pPr>
+        <w:rPr>
+          <w:rFonts w:ascii="Times New Roman" w:hAnsi="Times New Roman" w:cs="Times New Roman"/>
+        </w:rPr>
+      </w:pPr>
+      <w:r>
+        <w:rPr>
+          <w:rFonts w:ascii="Times New Roman" w:hAnsi="Times New Roman" w:cs="Times New Roman"/>
+          <w:b/>
+          <w:bCs/>
+        </w:rPr>
+        <w:lastRenderedPageBreak/>
         <w:t xml:space="preserve">Inventario: </w:t>
       </w:r>
       <w:r>
@@ -8662,7 +8545,6 @@
         <w:rPr>
           <w:rFonts w:ascii="Times New Roman" w:hAnsi="Times New Roman" w:cs="Times New Roman"/>
         </w:rPr>
-        <w:lastRenderedPageBreak/>
         <w:t>{</w:t>
       </w:r>
     </w:p>
@@ -8742,7 +8624,7 @@
                     <pic:cNvPicPr/>
                   </pic:nvPicPr>
                   <pic:blipFill>
-                    <a:blip r:embed="rId15">
+                    <a:blip r:embed="rId16">
                       <a:extLst>
                         <a:ext uri="{28A0092B-C50C-407E-A947-70E740481C1C}">
                           <a14:useLocalDpi xmlns:a14="http://schemas.microsoft.com/office/drawing/2010/main" val="0"/>
@@ -9077,7 +8959,7 @@
                     <pic:cNvPicPr/>
                   </pic:nvPicPr>
                   <pic:blipFill>
-                    <a:blip r:embed="rId16">
+                    <a:blip r:embed="rId17">
                       <a:extLst>
                         <a:ext uri="{28A0092B-C50C-407E-A947-70E740481C1C}">
                           <a14:useLocalDpi xmlns:a14="http://schemas.microsoft.com/office/drawing/2010/main" val="0"/>
@@ -9229,14 +9111,32 @@
       <w:pPr>
         <w:rPr>
           <w:rFonts w:ascii="Times New Roman" w:hAnsi="Times New Roman" w:cs="Times New Roman"/>
-        </w:rPr>
-      </w:pPr>
-      <w:r>
-        <w:rPr>
-          <w:rFonts w:ascii="Times New Roman" w:hAnsi="Times New Roman" w:cs="Times New Roman"/>
-          <w:b/>
-          <w:bCs/>
-        </w:rPr>
+          <w:b/>
+          <w:bCs/>
+        </w:rPr>
+      </w:pPr>
+      <w:r>
+        <w:rPr>
+          <w:rFonts w:ascii="Times New Roman" w:hAnsi="Times New Roman" w:cs="Times New Roman"/>
+          <w:b/>
+          <w:bCs/>
+        </w:rPr>
+        <w:br w:type="page"/>
+      </w:r>
+    </w:p>
+    <w:p>
+      <w:pPr>
+        <w:rPr>
+          <w:rFonts w:ascii="Times New Roman" w:hAnsi="Times New Roman" w:cs="Times New Roman"/>
+        </w:rPr>
+      </w:pPr>
+      <w:r>
+        <w:rPr>
+          <w:rFonts w:ascii="Times New Roman" w:hAnsi="Times New Roman" w:cs="Times New Roman"/>
+          <w:b/>
+          <w:bCs/>
+        </w:rPr>
+        <w:lastRenderedPageBreak/>
         <w:t xml:space="preserve">Ventas: </w:t>
       </w:r>
       <w:r>
@@ -9328,19 +9228,11 @@
         <w:t>ID_Venta</w:t>
       </w:r>
       <w:proofErr w:type="spellEnd"/>
-      <w:proofErr w:type="gramStart"/>
-      <w:r>
-        <w:rPr>
-          <w:rFonts w:ascii="Times New Roman" w:hAnsi="Times New Roman" w:cs="Times New Roman"/>
-        </w:rPr>
-        <w:t xml:space="preserve">",   </w:t>
-      </w:r>
-      <w:proofErr w:type="gramEnd"/>
-      <w:r>
-        <w:rPr>
-          <w:rFonts w:ascii="Times New Roman" w:hAnsi="Times New Roman" w:cs="Times New Roman"/>
-        </w:rPr>
-        <w:t xml:space="preserve">           // Clave primaria de la venta</w:t>
+      <w:r>
+        <w:rPr>
+          <w:rFonts w:ascii="Times New Roman" w:hAnsi="Times New Roman" w:cs="Times New Roman"/>
+        </w:rPr>
+        <w:t>",              // Clave primaria de la venta</w:t>
       </w:r>
     </w:p>
     <w:p>
@@ -9377,32 +9269,23 @@
         <w:t>string</w:t>
       </w:r>
       <w:proofErr w:type="spellEnd"/>
-      <w:proofErr w:type="gramStart"/>
-      <w:r>
-        <w:rPr>
-          <w:rFonts w:ascii="Times New Roman" w:hAnsi="Times New Roman" w:cs="Times New Roman"/>
-        </w:rPr>
-        <w:t xml:space="preserve">",   </w:t>
-      </w:r>
-      <w:proofErr w:type="gramEnd"/>
-      <w:r>
-        <w:rPr>
-          <w:rFonts w:ascii="Times New Roman" w:hAnsi="Times New Roman" w:cs="Times New Roman"/>
-        </w:rPr>
-        <w:t xml:space="preserve">      // ID del cliente que compra</w:t>
-      </w:r>
-    </w:p>
-    <w:p>
-      <w:pPr>
-        <w:rPr>
-          <w:rFonts w:ascii="Times New Roman" w:hAnsi="Times New Roman" w:cs="Times New Roman"/>
-        </w:rPr>
-      </w:pPr>
-      <w:r>
-        <w:rPr>
-          <w:rFonts w:ascii="Times New Roman" w:hAnsi="Times New Roman" w:cs="Times New Roman"/>
-        </w:rPr>
-        <w:lastRenderedPageBreak/>
+      <w:r>
+        <w:rPr>
+          <w:rFonts w:ascii="Times New Roman" w:hAnsi="Times New Roman" w:cs="Times New Roman"/>
+        </w:rPr>
+        <w:t>",         // ID del cliente que compra</w:t>
+      </w:r>
+    </w:p>
+    <w:p>
+      <w:pPr>
+        <w:rPr>
+          <w:rFonts w:ascii="Times New Roman" w:hAnsi="Times New Roman" w:cs="Times New Roman"/>
+        </w:rPr>
+      </w:pPr>
+      <w:r>
+        <w:rPr>
+          <w:rFonts w:ascii="Times New Roman" w:hAnsi="Times New Roman" w:cs="Times New Roman"/>
+        </w:rPr>
         <w:t xml:space="preserve">  "Fecha": "date",</w:t>
       </w:r>
     </w:p>
@@ -9704,7 +9587,7 @@
                     <pic:cNvPicPr/>
                   </pic:nvPicPr>
                   <pic:blipFill>
-                    <a:blip r:embed="rId17"/>
+                    <a:blip r:embed="rId18"/>
                     <a:stretch>
                       <a:fillRect/>
                     </a:stretch>
@@ -9729,14 +9612,32 @@
       <w:pPr>
         <w:rPr>
           <w:rFonts w:ascii="Times New Roman" w:hAnsi="Times New Roman" w:cs="Times New Roman"/>
-        </w:rPr>
-      </w:pPr>
-      <w:r>
-        <w:rPr>
-          <w:rFonts w:ascii="Times New Roman" w:hAnsi="Times New Roman" w:cs="Times New Roman"/>
-          <w:b/>
-          <w:bCs/>
-        </w:rPr>
+          <w:b/>
+          <w:bCs/>
+        </w:rPr>
+      </w:pPr>
+      <w:r>
+        <w:rPr>
+          <w:rFonts w:ascii="Times New Roman" w:hAnsi="Times New Roman" w:cs="Times New Roman"/>
+          <w:b/>
+          <w:bCs/>
+        </w:rPr>
+        <w:br w:type="page"/>
+      </w:r>
+    </w:p>
+    <w:p>
+      <w:pPr>
+        <w:rPr>
+          <w:rFonts w:ascii="Times New Roman" w:hAnsi="Times New Roman" w:cs="Times New Roman"/>
+        </w:rPr>
+      </w:pPr>
+      <w:r>
+        <w:rPr>
+          <w:rFonts w:ascii="Times New Roman" w:hAnsi="Times New Roman" w:cs="Times New Roman"/>
+          <w:b/>
+          <w:bCs/>
+        </w:rPr>
+        <w:lastRenderedPageBreak/>
         <w:t xml:space="preserve">Asistencia: </w:t>
       </w:r>
       <w:r>
@@ -9994,7 +9895,6 @@
           <w:rFonts w:ascii="Times New Roman" w:hAnsi="Times New Roman" w:cs="Times New Roman"/>
           <w:noProof/>
         </w:rPr>
-        <w:lastRenderedPageBreak/>
         <w:drawing>
           <wp:inline distT="0" distB="0" distL="0" distR="0" wp14:anchorId="3DABE95C" wp14:editId="0724474A">
             <wp:extent cx="2229161" cy="2172003"/>
@@ -10011,7 +9911,7 @@
                     <pic:cNvPicPr/>
                   </pic:nvPicPr>
                   <pic:blipFill>
-                    <a:blip r:embed="rId18"/>
+                    <a:blip r:embed="rId19"/>
                     <a:stretch>
                       <a:fillRect/>
                     </a:stretch>
@@ -10128,16 +10028,8 @@
         <w:rPr>
           <w:rFonts w:ascii="Times New Roman" w:hAnsi="Times New Roman" w:cs="Times New Roman"/>
         </w:rPr>
-        <w:t>, Instructores, Ventas, Productos</w:t>
-      </w:r>
-      <w:proofErr w:type="gramStart"/>
-      <w:r>
-        <w:rPr>
-          <w:rFonts w:ascii="Times New Roman" w:hAnsi="Times New Roman" w:cs="Times New Roman"/>
-        </w:rPr>
-        <w:t>, )</w:t>
-      </w:r>
-      <w:proofErr w:type="gramEnd"/>
+        <w:t>, Instructores, Ventas, Productos, )</w:t>
+      </w:r>
       <w:r>
         <w:rPr>
           <w:rFonts w:ascii="Times New Roman" w:hAnsi="Times New Roman" w:cs="Times New Roman"/>
@@ -10186,7 +10078,7 @@
                     <pic:cNvPicPr/>
                   </pic:nvPicPr>
                   <pic:blipFill>
-                    <a:blip r:embed="rId19">
+                    <a:blip r:embed="rId20">
                       <a:extLst>
                         <a:ext uri="{28A0092B-C50C-407E-A947-70E740481C1C}">
                           <a14:useLocalDpi xmlns:a14="http://schemas.microsoft.com/office/drawing/2010/main" val="0"/>
@@ -10402,12 +10294,12 @@
       <w:pPr>
         <w:pStyle w:val="Ttulo2"/>
       </w:pPr>
-      <w:bookmarkStart w:id="2" w:name="_Toc215646364"/>
+      <w:bookmarkStart w:id="3" w:name="_Toc215667698"/>
       <w:r>
         <w:lastRenderedPageBreak/>
         <w:t>Cambios al pasar de E/R a MongoDB</w:t>
       </w:r>
-      <w:bookmarkEnd w:id="2"/>
+      <w:bookmarkEnd w:id="3"/>
     </w:p>
     <w:p>
       <w:pPr>
@@ -10955,10 +10847,48 @@
           <w:rFonts w:ascii="Times New Roman" w:hAnsi="Times New Roman" w:cs="Times New Roman"/>
         </w:rPr>
       </w:pPr>
+      <w:hyperlink r:id="rId21" w:history="1">
+        <w:r>
+          <w:rPr>
+            <w:rStyle w:val="Hipervnculo"/>
+            <w:rFonts w:ascii="Times New Roman" w:hAnsi="Times New Roman" w:cs="Times New Roman"/>
+          </w:rPr>
+          <w:t>Enlace d</w:t>
+        </w:r>
+        <w:r>
+          <w:rPr>
+            <w:rStyle w:val="Hipervnculo"/>
+            <w:rFonts w:ascii="Times New Roman" w:hAnsi="Times New Roman" w:cs="Times New Roman"/>
+          </w:rPr>
+          <w:t>e</w:t>
+        </w:r>
+        <w:r>
+          <w:rPr>
+            <w:rStyle w:val="Hipervnculo"/>
+            <w:rFonts w:ascii="Times New Roman" w:hAnsi="Times New Roman" w:cs="Times New Roman"/>
+          </w:rPr>
+          <w:t xml:space="preserve"> </w:t>
+        </w:r>
+        <w:proofErr w:type="spellStart"/>
+        <w:r>
+          <w:rPr>
+            <w:rStyle w:val="Hipervnculo"/>
+            <w:rFonts w:ascii="Times New Roman" w:hAnsi="Times New Roman" w:cs="Times New Roman"/>
+          </w:rPr>
+          <w:t>Github</w:t>
+        </w:r>
+        <w:proofErr w:type="spellEnd"/>
+      </w:hyperlink>
+      <w:r>
+        <w:rPr>
+          <w:rFonts w:ascii="Times New Roman" w:hAnsi="Times New Roman" w:cs="Times New Roman"/>
+        </w:rPr>
+        <w:t xml:space="preserve"> con lo último que hicimos de Pokémon.</w:t>
+      </w:r>
     </w:p>
     <w:sectPr>
-      <w:headerReference w:type="default" r:id="rId20"/>
-      <w:footerReference w:type="default" r:id="rId21"/>
+      <w:headerReference w:type="default" r:id="rId22"/>
+      <w:footerReference w:type="default" r:id="rId23"/>
       <w:pgSz w:w="11906" w:h="16838"/>
       <w:pgMar w:top="1417" w:right="1701" w:bottom="1417" w:left="1701" w:header="708" w:footer="708" w:gutter="0"/>
       <w:pgNumType w:start="0"/>
@@ -15592,6 +15522,30 @@
       <w:u w:val="single"/>
     </w:rPr>
   </w:style>
+  <w:style w:type="character" w:styleId="Mencinsinresolver">
+    <w:name w:val="Unresolved Mention"/>
+    <w:basedOn w:val="Fuentedeprrafopredeter"/>
+    <w:uiPriority w:val="99"/>
+    <w:semiHidden/>
+    <w:unhideWhenUsed/>
+    <w:rsid w:val="004440BE"/>
+    <w:rPr>
+      <w:color w:val="605E5C"/>
+      <w:shd w:val="clear" w:color="auto" w:fill="E1DFDD"/>
+    </w:rPr>
+  </w:style>
+  <w:style w:type="character" w:styleId="Hipervnculovisitado">
+    <w:name w:val="FollowedHyperlink"/>
+    <w:basedOn w:val="Fuentedeprrafopredeter"/>
+    <w:uiPriority w:val="99"/>
+    <w:semiHidden/>
+    <w:unhideWhenUsed/>
+    <w:rsid w:val="00291797"/>
+    <w:rPr>
+      <w:color w:val="96607D" w:themeColor="followedHyperlink"/>
+      <w:u w:val="single"/>
+    </w:rPr>
+  </w:style>
 </w:styles>
 </file>
 

</xml_diff>